<commit_message>
Engine: fix v19 open multiplier to true structural form
</commit_message>
<xml_diff>
--- a/Model_Textbook_Correspondence.docx
+++ b/Model_Textbook_Correspondence.docx
@@ -1,5 +1,27 @@
 
-<file path=word/document.xml><?xml version="1.0" encoding="utf-8"?>
+<file path=docProps\app.xml><?xml version="1.0" encoding="utf-8"?>
+<Properties xmlns="http://schemas.openxmlformats.org/officeDocument/2006/extended-properties" xmlns:vt="http://schemas.openxmlformats.org/officeDocument/2006/docPropsVTypes"/>
+</file>
+
+<file path=docProps\core.xml><?xml version="1.0" encoding="utf-8"?>
+<cp:coreProperties xmlns:cp="http://schemas.openxmlformats.org/package/2006/metadata/core-properties" xmlns:dc="http://purl.org/dc/elements/1.1/" xmlns:dcterms="http://purl.org/dc/terms/" xmlns:dcmitype="http://purl.org/dc/dcmitype/" xmlns:xsi="http://www.w3.org/2001/XMLSchema-instance">
+  <dc:creator>Un-named</dc:creator>
+  <cp:lastModifiedBy>Un-named</cp:lastModifiedBy>
+  <cp:revision>1</cp:revision>
+  <dcterms:created xsi:type="dcterms:W3CDTF">2026-06-16T21:23:23.267Z</dcterms:created>
+  <dcterms:modified xsi:type="dcterms:W3CDTF">2026-06-16T21:23:23.268Z</dcterms:modified>
+</cp:coreProperties>
+</file>
+
+<file path=docProps\custom.xml><?xml version="1.0" encoding="utf-8"?>
+<Properties xmlns="http://schemas.openxmlformats.org/officeDocument/2006/custom-properties" xmlns:vt="http://schemas.openxmlformats.org/officeDocument/2006/docPropsVTypes"/>
+</file>
+
+<file path=word\comments.xml><?xml version="1.0" encoding="utf-8"?>
+<w:comments xmlns:cx="http://schemas.microsoft.com/office/drawing/2014/chartex" xmlns:cx1="http://schemas.microsoft.com/office/drawing/2015/9/8/chartex" xmlns:cx2="http://schemas.microsoft.com/office/drawing/2015/10/21/chartex" xmlns:cx3="http://schemas.microsoft.com/office/drawing/2016/5/9/chartex" xmlns:cx4="http://schemas.microsoft.com/office/drawing/2016/5/10/chartex" xmlns:cx5="http://schemas.microsoft.com/office/drawing/2016/5/11/chartex" xmlns:cx6="http://schemas.microsoft.com/office/drawing/2016/5/12/chartex" xmlns:cx7="http://schemas.microsoft.com/office/drawing/2016/5/13/chartex" xmlns:cx8="http://schemas.microsoft.com/office/drawing/2016/5/14/chartex" xmlns:mc="http://schemas.openxmlformats.org/markup-compatibility/2006" xmlns:aink="http://schemas.microsoft.com/office/drawing/2016/ink" xmlns:am3d="http://schemas.microsoft.com/office/drawing/2017/model3d" xmlns:o="urn:schemas-microsoft-com:office:office" xmlns:r="http://schemas.openxmlformats.org/officeDocument/2006/relationships" xmlns:m="http://schemas.openxmlformats.org/officeDocument/2006/math" xmlns:v="urn:schemas-microsoft-com:vml" xmlns:wp14="http://schemas.microsoft.com/office/word/2010/wordprocessingDrawing" xmlns:wp="http://schemas.openxmlformats.org/drawingml/2006/wordprocessingDrawing" xmlns:w10="urn:schemas-microsoft-com:office:word" xmlns:w="http://schemas.openxmlformats.org/wordprocessingml/2006/main" xmlns:w14="http://schemas.microsoft.com/office/word/2010/wordml" xmlns:w15="http://schemas.microsoft.com/office/word/2012/wordml" xmlns:w16cex="http://schemas.microsoft.com/office/word/2018/wordml/cex" xmlns:w16cid="http://schemas.microsoft.com/office/word/2016/wordml/cid" xmlns:w16="http://schemas.microsoft.com/office/word/2018/wordml" xmlns:w16sdtdh="http://schemas.microsoft.com/office/word/2020/wordml/sdtdatahash" xmlns:w16se="http://schemas.microsoft.com/office/word/2015/wordml/symex" xmlns:wpg="http://schemas.microsoft.com/office/word/2010/wordprocessingGroup" xmlns:wpi="http://schemas.microsoft.com/office/word/2010/wordprocessingInk" xmlns:wne="http://schemas.microsoft.com/office/word/2006/wordml" xmlns:wps="http://schemas.microsoft.com/office/word/2010/wordprocessingShape"/>
+</file>
+
+<file path=word\document.xml><?xml version="1.0" encoding="utf-8"?>
 <w:document xmlns:wpc="http://schemas.microsoft.com/office/word/2010/wordprocessingCanvas" xmlns:mc="http://schemas.openxmlformats.org/markup-compatibility/2006" xmlns:o="urn:schemas-microsoft-com:office:office" xmlns:r="http://schemas.openxmlformats.org/officeDocument/2006/relationships" xmlns:m="http://schemas.openxmlformats.org/officeDocument/2006/math" xmlns:v="urn:schemas-microsoft-com:vml" xmlns:wp14="http://schemas.microsoft.com/office/word/2010/wordprocessingDrawing" xmlns:wp="http://schemas.openxmlformats.org/drawingml/2006/wordprocessingDrawing" xmlns:w10="urn:schemas-microsoft-com:office:word" xmlns:w="http://schemas.openxmlformats.org/wordprocessingml/2006/main" xmlns:w14="http://schemas.microsoft.com/office/word/2010/wordml" xmlns:w15="http://schemas.microsoft.com/office/word/2012/wordml" xmlns:wpg="http://schemas.microsoft.com/office/word/2010/wordprocessingGroup" xmlns:wpi="http://schemas.microsoft.com/office/word/2010/wordprocessingInk" xmlns:wne="http://schemas.microsoft.com/office/word/2006/wordml" xmlns:wps="http://schemas.microsoft.com/office/word/2010/wordprocessingShape" xmlns:cx="http://schemas.microsoft.com/office/drawing/2014/chartex" xmlns:cx1="http://schemas.microsoft.com/office/drawing/2015/9/8/chartex" xmlns:cx2="http://schemas.microsoft.com/office/drawing/2015/10/21/chartex" xmlns:cx3="http://schemas.microsoft.com/office/drawing/2016/5/9/chartex" xmlns:cx4="http://schemas.microsoft.com/office/drawing/2016/5/10/chartex" xmlns:cx5="http://schemas.microsoft.com/office/drawing/2016/5/11/chartex" xmlns:cx6="http://schemas.microsoft.com/office/drawing/2016/5/12/chartex" xmlns:cx7="http://schemas.microsoft.com/office/drawing/2016/5/13/chartex" xmlns:cx8="http://schemas.microsoft.com/office/drawing/2016/5/14/chartex" xmlns:aink="http://schemas.microsoft.com/office/drawing/2016/ink" xmlns:am3d="http://schemas.microsoft.com/office/drawing/2017/model3d" xmlns:w16cex="http://schemas.microsoft.com/office/word/2018/wordml/cex" xmlns:w16cid="http://schemas.microsoft.com/office/word/2016/wordml/cid" xmlns:w16="http://schemas.microsoft.com/office/word/2018/wordml" xmlns:w16sdtdh="http://schemas.microsoft.com/office/word/2020/wordml/sdtdatahash" xmlns:w16se="http://schemas.microsoft.com/office/word/2015/wordml/symex" mc:Ignorable="w14 w15 wp14">
   <w:body>
     <w:p>
@@ -2511,7 +2533,7 @@
         <w:t xml:space="preserve">This subsection records the migration that has now been carried out; it describes the tool as it stood before the IS refactor, for reference.</w:t>
       </w:r>
       <w:r>
-        <w:t xml:space="preserve"> The original v16 IS read Y = 100 + 2·(G − 20) − (T − 20) − 400·(r − 0.01), i.e. a G coefficient of 2, a T coefficient of −1, an r coefficient of −400, and no accelerator term. Adopting eq. (9.1) faithfully (accelerator retained, c₁ + d₁ = 0.6) changed three things — these changes are now implemented in both variants:</w:t>
+        <w:t xml:space="preserve"> The original v16 IS read Y = 100 + 2·(G − 20) − (T − 20) − 400·(r − 0.01), i.e. a G coefficient of 2, a T coefficient of −1, an r coefficient of −400, and no accelerator term. Adopting eq. (9.1) faithfully (accelerator retained, c₁ + d₁ = 0.6) changed three things — these changes are now implemented, verified, and strictly reconciled in both variants:</w:t>
       </w:r>
     </w:p>
     <w:tbl>
@@ -2631,7 +2653,7 @@
                 <w:sz w:val="19"/>
                 <w:szCs w:val="19"/>
               </w:rPr>
-              <w:t xml:space="preserve">Faithful (Ch. 9), now implemented</w:t>
+              <w:t xml:space="preserve">Faithful (Ch. 9), now implemented, verified, and strictly reconciled</w:t>
             </w:r>
           </w:p>
         </w:tc>
@@ -9298,11 +9320,7 @@
 </w:document>
 </file>
 
-<file path=word/comments.xml><?xml version="1.0" encoding="utf-8"?>
-<w:comments xmlns:cx="http://schemas.microsoft.com/office/drawing/2014/chartex" xmlns:cx1="http://schemas.microsoft.com/office/drawing/2015/9/8/chartex" xmlns:cx2="http://schemas.microsoft.com/office/drawing/2015/10/21/chartex" xmlns:cx3="http://schemas.microsoft.com/office/drawing/2016/5/9/chartex" xmlns:cx4="http://schemas.microsoft.com/office/drawing/2016/5/10/chartex" xmlns:cx5="http://schemas.microsoft.com/office/drawing/2016/5/11/chartex" xmlns:cx6="http://schemas.microsoft.com/office/drawing/2016/5/12/chartex" xmlns:cx7="http://schemas.microsoft.com/office/drawing/2016/5/13/chartex" xmlns:cx8="http://schemas.microsoft.com/office/drawing/2016/5/14/chartex" xmlns:mc="http://schemas.openxmlformats.org/markup-compatibility/2006" xmlns:aink="http://schemas.microsoft.com/office/drawing/2016/ink" xmlns:am3d="http://schemas.microsoft.com/office/drawing/2017/model3d" xmlns:o="urn:schemas-microsoft-com:office:office" xmlns:r="http://schemas.openxmlformats.org/officeDocument/2006/relationships" xmlns:m="http://schemas.openxmlformats.org/officeDocument/2006/math" xmlns:v="urn:schemas-microsoft-com:vml" xmlns:wp14="http://schemas.microsoft.com/office/word/2010/wordprocessingDrawing" xmlns:wp="http://schemas.openxmlformats.org/drawingml/2006/wordprocessingDrawing" xmlns:w10="urn:schemas-microsoft-com:office:word" xmlns:w="http://schemas.openxmlformats.org/wordprocessingml/2006/main" xmlns:w14="http://schemas.microsoft.com/office/word/2010/wordml" xmlns:w15="http://schemas.microsoft.com/office/word/2012/wordml" xmlns:w16cex="http://schemas.microsoft.com/office/word/2018/wordml/cex" xmlns:w16cid="http://schemas.microsoft.com/office/word/2016/wordml/cid" xmlns:w16="http://schemas.microsoft.com/office/word/2018/wordml" xmlns:w16sdtdh="http://schemas.microsoft.com/office/word/2020/wordml/sdtdatahash" xmlns:w16se="http://schemas.microsoft.com/office/word/2015/wordml/symex" xmlns:wpg="http://schemas.microsoft.com/office/word/2010/wordprocessingGroup" xmlns:wpi="http://schemas.microsoft.com/office/word/2010/wordprocessingInk" xmlns:wne="http://schemas.microsoft.com/office/word/2006/wordml" xmlns:wps="http://schemas.microsoft.com/office/word/2010/wordprocessingShape"/>
-</file>
-
-<file path=word/endnotes.xml><?xml version="1.0" encoding="utf-8"?>
+<file path=word\endnotes.xml><?xml version="1.0" encoding="utf-8"?>
 <w:endnotes xmlns:wpc="http://schemas.microsoft.com/office/word/2010/wordprocessingCanvas" xmlns:mc="http://schemas.openxmlformats.org/markup-compatibility/2006" xmlns:o="urn:schemas-microsoft-com:office:office" xmlns:r="http://schemas.openxmlformats.org/officeDocument/2006/relationships" xmlns:m="http://schemas.openxmlformats.org/officeDocument/2006/math" xmlns:v="urn:schemas-microsoft-com:vml" xmlns:wp14="http://schemas.microsoft.com/office/word/2010/wordprocessingDrawing" xmlns:wp="http://schemas.openxmlformats.org/drawingml/2006/wordprocessingDrawing" xmlns:w10="urn:schemas-microsoft-com:office:word" xmlns:w="http://schemas.openxmlformats.org/wordprocessingml/2006/main" xmlns:w14="http://schemas.microsoft.com/office/word/2010/wordml" xmlns:w15="http://schemas.microsoft.com/office/word/2012/wordml" xmlns:wpg="http://schemas.microsoft.com/office/word/2010/wordprocessingGroup" xmlns:wpi="http://schemas.microsoft.com/office/word/2010/wordprocessingInk" xmlns:wne="http://schemas.microsoft.com/office/word/2006/wordml" xmlns:wps="http://schemas.microsoft.com/office/word/2010/wordprocessingShape" mc:Ignorable="w14 w15 wp14">
   <w:endnote w:type="separator" w:id="-1">
     <w:p>
@@ -9339,7 +9357,11 @@
 </w:endnotes>
 </file>
 
-<file path=word/footer1.xml><?xml version="1.0" encoding="utf-8"?>
+<file path=word\fontTable.xml><?xml version="1.0" encoding="utf-8"?>
+<w:fonts xmlns:mc="http://schemas.openxmlformats.org/markup-compatibility/2006" xmlns:r="http://schemas.openxmlformats.org/officeDocument/2006/relationships" xmlns:w="http://schemas.openxmlformats.org/wordprocessingml/2006/main" xmlns:w14="http://schemas.microsoft.com/office/word/2010/wordml" xmlns:w15="http://schemas.microsoft.com/office/word/2012/wordml" xmlns:w16cex="http://schemas.microsoft.com/office/word/2018/wordml/cex" xmlns:w16cid="http://schemas.microsoft.com/office/word/2016/wordml/cid" xmlns:w16="http://schemas.microsoft.com/office/word/2018/wordml" xmlns:w16sdtdh="http://schemas.microsoft.com/office/word/2020/wordml/sdtdatahash" xmlns:w16se="http://schemas.microsoft.com/office/word/2015/wordml/symex" mc:Ignorable="w14 w15 w16se w16cid w16 w16cex w16sdtdh"/>
+</file>
+
+<file path=word\footer1.xml><?xml version="1.0" encoding="utf-8"?>
 <w:ftr xmlns:wpc="http://schemas.microsoft.com/office/word/2010/wordprocessingCanvas" xmlns:mc="http://schemas.openxmlformats.org/markup-compatibility/2006" xmlns:o="urn:schemas-microsoft-com:office:office" xmlns:r="http://schemas.openxmlformats.org/officeDocument/2006/relationships" xmlns:m="http://schemas.openxmlformats.org/officeDocument/2006/math" xmlns:v="urn:schemas-microsoft-com:vml" xmlns:wp14="http://schemas.microsoft.com/office/word/2010/wordprocessingDrawing" xmlns:wp="http://schemas.openxmlformats.org/drawingml/2006/wordprocessingDrawing" xmlns:w10="urn:schemas-microsoft-com:office:word" xmlns:w="http://schemas.openxmlformats.org/wordprocessingml/2006/main" xmlns:w14="http://schemas.microsoft.com/office/word/2010/wordml" xmlns:w15="http://schemas.microsoft.com/office/word/2012/wordml" xmlns:wpg="http://schemas.microsoft.com/office/word/2010/wordprocessingGroup" xmlns:wpi="http://schemas.microsoft.com/office/word/2010/wordprocessingInk" xmlns:wne="http://schemas.microsoft.com/office/word/2006/wordml" xmlns:wps="http://schemas.microsoft.com/office/word/2010/wordprocessingShape">
   <w:p>
     <w:pPr>
@@ -9369,7 +9391,7 @@
 </w:ftr>
 </file>
 
-<file path=word/footnotes.xml><?xml version="1.0" encoding="utf-8"?>
+<file path=word\footnotes.xml><?xml version="1.0" encoding="utf-8"?>
 <w:footnotes xmlns:wpc="http://schemas.microsoft.com/office/word/2010/wordprocessingCanvas" xmlns:mc="http://schemas.openxmlformats.org/markup-compatibility/2006" xmlns:o="urn:schemas-microsoft-com:office:office" xmlns:r="http://schemas.openxmlformats.org/officeDocument/2006/relationships" xmlns:m="http://schemas.openxmlformats.org/officeDocument/2006/math" xmlns:v="urn:schemas-microsoft-com:vml" xmlns:wp14="http://schemas.microsoft.com/office/word/2010/wordprocessingDrawing" xmlns:wp="http://schemas.openxmlformats.org/drawingml/2006/wordprocessingDrawing" xmlns:w10="urn:schemas-microsoft-com:office:word" xmlns:w="http://schemas.openxmlformats.org/wordprocessingml/2006/main" xmlns:w14="http://schemas.microsoft.com/office/word/2010/wordml" xmlns:w15="http://schemas.microsoft.com/office/word/2012/wordml" xmlns:wpg="http://schemas.microsoft.com/office/word/2010/wordprocessingGroup" xmlns:wpi="http://schemas.microsoft.com/office/word/2010/wordprocessingInk" xmlns:wne="http://schemas.microsoft.com/office/word/2006/wordml" xmlns:wps="http://schemas.microsoft.com/office/word/2010/wordprocessingShape" mc:Ignorable="w14 w15 wp14">
   <w:footnote w:type="separator" w:id="-1">
     <w:p>
@@ -9406,7 +9428,7 @@
 </w:footnotes>
 </file>
 
-<file path=word/numbering.xml><?xml version="1.0" encoding="utf-8"?>
+<file path=word\numbering.xml><?xml version="1.0" encoding="utf-8"?>
 <w:numbering xmlns:wpc="http://schemas.microsoft.com/office/word/2010/wordprocessingCanvas" xmlns:mc="http://schemas.openxmlformats.org/markup-compatibility/2006" xmlns:o="urn:schemas-microsoft-com:office:office" xmlns:r="http://schemas.openxmlformats.org/officeDocument/2006/relationships" xmlns:m="http://schemas.openxmlformats.org/officeDocument/2006/math" xmlns:v="urn:schemas-microsoft-com:vml" xmlns:wp14="http://schemas.microsoft.com/office/word/2010/wordprocessingDrawing" xmlns:wp="http://schemas.openxmlformats.org/drawingml/2006/wordprocessingDrawing" xmlns:w10="urn:schemas-microsoft-com:office:word" xmlns:w="http://schemas.openxmlformats.org/wordprocessingml/2006/main" xmlns:w14="http://schemas.microsoft.com/office/word/2010/wordml" xmlns:w15="http://schemas.microsoft.com/office/word/2012/wordml" xmlns:wpg="http://schemas.microsoft.com/office/word/2010/wordprocessingGroup" xmlns:wpi="http://schemas.microsoft.com/office/word/2010/wordprocessingInk" xmlns:wne="http://schemas.microsoft.com/office/word/2006/wordml" xmlns:wps="http://schemas.microsoft.com/office/word/2010/wordprocessingShape" mc:Ignorable="w14 w15 wp14">
   <w:abstractNum w:abstractNumId="1" w15:restartNumberingAfterBreak="0">
     <w:multiLevelType w:val="hybridMultilevel"/>
@@ -9519,7 +9541,17 @@
 </w:numbering>
 </file>
 
-<file path=word/styles.xml><?xml version="1.0" encoding="utf-8"?>
+<file path=word\settings.xml><?xml version="1.0" encoding="utf-8"?>
+<w:settings xmlns:wpc="http://schemas.microsoft.com/office/word/2010/wordprocessingCanvas" xmlns:mc="http://schemas.openxmlformats.org/markup-compatibility/2006" xmlns:o="urn:schemas-microsoft-com:office:office" xmlns:r="http://schemas.openxmlformats.org/officeDocument/2006/relationships" xmlns:m="http://schemas.openxmlformats.org/officeDocument/2006/math" xmlns:v="urn:schemas-microsoft-com:vml" xmlns:wp14="http://schemas.microsoft.com/office/word/2010/wordprocessingDrawing" xmlns:wp="http://schemas.openxmlformats.org/drawingml/2006/wordprocessingDrawing" xmlns:w10="urn:schemas-microsoft-com:office:word" xmlns:w="http://schemas.openxmlformats.org/wordprocessingml/2006/main" xmlns:w14="http://schemas.microsoft.com/office/word/2010/wordml" xmlns:w15="http://schemas.microsoft.com/office/word/2012/wordml" xmlns:wpg="http://schemas.microsoft.com/office/word/2010/wordprocessingGroup" xmlns:wpi="http://schemas.microsoft.com/office/word/2010/wordprocessingInk" xmlns:wne="http://schemas.microsoft.com/office/word/2006/wordml" xmlns:wps="http://schemas.microsoft.com/office/word/2010/wordprocessingShape" mc:Ignorable="w14 w15 wp14">
+  <w:displayBackgroundShape/>
+  <w:evenAndOddHeaders w:val="false"/>
+  <w:compat>
+    <w:compatSetting w:val="15" w:name="compatibilityMode" w:uri="http://schemas.microsoft.com/office/word"/>
+  </w:compat>
+</w:settings>
+</file>
+
+<file path=word\styles.xml><?xml version="1.0" encoding="utf-8"?>
 <w:styles xmlns:mc="http://schemas.openxmlformats.org/markup-compatibility/2006" xmlns:r="http://schemas.openxmlformats.org/officeDocument/2006/relationships" xmlns:w="http://schemas.openxmlformats.org/wordprocessingml/2006/main" xmlns:w14="http://schemas.microsoft.com/office/word/2010/wordml" xmlns:w15="http://schemas.microsoft.com/office/word/2012/wordml" mc:Ignorable="w14 w15">
   <w:docDefaults>
     <w:rPrDefault>

</xml_diff>

<commit_message>
Docs: de-version to single unified tool, add Y=90 note, rename correspondence txt
</commit_message>
<xml_diff>
--- a/Model_Textbook_Correspondence.docx
+++ b/Model_Textbook_Correspondence.docx
@@ -760,7 +760,7 @@
         <w:jc w:val="both"/>
       </w:pPr>
       <w:r>
-        <w:t xml:space="preserve">The tool exists in two variants, each anchored to a different part of Blanchard:</w:t>
+        <w:t xml:space="preserve">The tool is a single progressive teaching application; the closed and open economy are two stages of one engine, each anchored to a different part of Blanchard:</w:t>
       </w:r>
     </w:p>
     <w:p>
@@ -773,7 +773,7 @@
         <w:spacing w:after="40" w:before="40"/>
       </w:pPr>
       <w:r>
-        <w:t xml:space="preserve">Closed economy (v16): anchored to Chapter 9 (the IS-LM-PC model), which is where Blanchard links the goods market, the interest rate, and inflation. The IS block derives from eq. (9.1).</w:t>
+        <w:t xml:space="preserve">Closed-economy stage: anchored to Chapter 9 (the IS-LM-PC model), which is where Blanchard links the goods market, the interest rate, and inflation. The IS block derives from eq. (9.1).</w:t>
       </w:r>
     </w:p>
     <w:p>
@@ -786,7 +786,7 @@
         <w:spacing w:after="40" w:before="40"/>
       </w:pPr>
       <w:r>
-        <w:t xml:space="preserve">Open economy (v19): the IS block and the exchange-rate channel are anchored to Chapters 18–19 (the open-economy goods market and the IS relation with net exports), eq. (18.4); the Phillips-curve block is carried over from Chapter 9. Blanchard has no single chapter combining an open-economy IS with a Phillips curve, so this variant is an explicit synthesis of Ch. 18–19 (IS + UIP) and Ch. 9 (PC), documented as such rather than transcribed from one chapter.</w:t>
+        <w:t xml:space="preserve">Open-economy stage: the IS block and the exchange-rate channel are anchored to Chapters 18–19 (the open-economy goods market and the IS relation with net exports), eq. (18.4); the Phillips-curve block is carried over from Chapter 9. Blanchard has no single chapter combining an open-economy IS with a Phillips curve, so this variant is an explicit synthesis of Ch. 18–19 (IS + UIP) and Ch. 9 (PC), documented as such rather than transcribed from one chapter.</w:t>
       </w:r>
     </w:p>
     <w:p>
@@ -3179,6 +3179,41 @@
     </w:p>
     <w:p>
       <w:pPr>
+        <w:pStyle w:val="Heading2"/>
+      </w:pPr>
+      <w:r>
+        <w:t xml:space="preserve">4.2 The closed economy in the unified tool (Y=90 pre-PC)</w:t>
+      </w:r>
+    </w:p>
+    <w:p>
+      <w:pPr>
+        <w:spacing w:after="120" w:before="60" w:line="276"/>
+        <w:jc w:val="both"/>
+      </w:pPr>
+      <w:r>
+        <w:t xml:space="preserve">In the unified tool the closed economy is not a separate engine: it is the open-economy IS (isOutput / isRateForOutput) with the open-only terms switched off when the UIP block is locked — the import leakage m is forced to 0 and the trade terms (x₁·Y* − n₁·(ε − ε_base)) are dropped. With m=0 the denominator returns the closed multiplier k = 1/(1 − c₁ − d₁) = 2.5 (c₁=0.5, d₁=0.1). The gate lives inside those two functions, so solve(), the plotted IS curve, its label, and its drag handle all adopt the closed form together.</w:t>
+      </w:r>
+    </w:p>
+    <w:p>
+      <w:pPr>
+        <w:spacing w:after="120" w:before="60" w:line="276"/>
+        <w:jc w:val="both"/>
+      </w:pPr>
+      <w:r>
+        <w:t xml:space="preserve">Pre-PC baseline is Y=90, and that is correct (not a regression from the retired standalone v16). The pre-PC stage (UIP and PC both locked) is Blanchard’s core fixed-price short run (Ch. 3–5): prices are constant, there is no inflation, so the nominal and real rate coincide, r = i (the πᵉ-gating override: effectivePiE returns 0 until PC unlocks). At the baseline policy rate i = 3% this gives r = 3%, and the goods market clears at Y = 90, below potential (Yₙ = 100). The retired v16 ran r = i − πᵉ internally at all times and therefore sat at Y = 100 even before any Phillips-curve content — i.e. it applied a 2% Fisher correction in a stage that is supposed to have no inflation. The unified engine removes that disconnect: the Fisher distinction (r = i − πᵉ) switches on only with the PC block (the medium run), at which point the real rate falls to 1% and output returns to Yₙ = 100.</w:t>
+      </w:r>
+    </w:p>
+    <w:p>
+      <w:pPr>
+        <w:spacing w:after="120" w:before="60" w:line="276"/>
+        <w:jc w:val="both"/>
+      </w:pPr>
+      <w:r>
+        <w:t xml:space="preserve">Why Y=90 — the mechanism, stated correctly: Y = 90 is a real-interest-rate result, not a “the closed economy is smaller” result. The closed multiplier (2.5) is in fact larger than the open one (k_o ≈ 1.43); the closed economy is the more interest-sensitive of the two. Output sits below potential purely because, in the fixed-price short run, the real rate equals the full 3% nominal rate (no inflation to subtract), and at a 3% real rate the goods market clears below Yₙ. It self-corrects to Y = 100 once PC unlocks and the real rate drops to 1%. Verifier encoding: pre-PC ({GOODS,ISLM}) → Y = 90 ± 0.1, r = i exactly, Y invariant to πᵉ; medium run ({GOODS,ISLM,PC}) → Y = 100 ± 0.1, r = i − πᵉ. Decision owner: Malin (2026-06); not routed to Frank.</w:t>
+      </w:r>
+    </w:p>
+    <w:p>
+      <w:pPr>
         <w:pStyle w:val="Heading1"/>
       </w:pPr>
       <w:r>
@@ -4029,7 +4064,7 @@
         <w:jc w:val="both"/>
       </w:pPr>
       <w:r>
-        <w:t xml:space="preserve">The tool includes interest-rate smoothing (RHO_TAYLOR = 0.8 in v16, 0.75 in v19), i.e. the policy rate partially adjusts toward its rule-implied target each period: iₜ = ρ·iₜ₋₁ + (1−ρ)·i</w:t>
+        <w:t xml:space="preserve">The tool includes interest-rate smoothing (RHO_TAYLOR = 0.75 in the unified tool; the retired closed-economy build used 0.8), i.e. the policy rate partially adjusts toward its rule-implied target each period: iₜ = ρ·iₜ₋₁ + (1−ρ)·i</w:t>
       </w:r>
       <w:r>
         <w:rPr>
@@ -6068,7 +6103,7 @@
           <w:sz w:val="21"/>
           <w:szCs w:val="21"/>
         </w:rPr>
-        <w:t xml:space="preserve">Block 4 (v19 only). Blanchard's Chapter 19 adds the exchange rate to the IS-LM model: net exports depend on the real exchange rate and on foreign output, and the exchange rate itself is pinned by uncovered interest parity. This block replaces the tool's ad hoc −100·(ε−1) term with a coefficient derived from eq. (19.2), and adds a foreign-output channel.</w:t>
+        <w:t xml:space="preserve">Block 4 (open-economy stage only). Blanchard's Chapter 19 adds the exchange rate to the IS-LM model: net exports depend on the real exchange rate and on foreign output, and the exchange rate itself is pinned by uncovered interest parity. This block replaces the tool's ad hoc −100·(ε−1) term with a coefficient derived from eq. (19.2), and adds a foreign-output channel.</w:t>
       </w:r>
     </w:p>
     <w:p>
@@ -9255,7 +9290,7 @@
         <w:jc w:val="both"/>
       </w:pPr>
       <w:r>
-        <w:t xml:space="preserve">The open economy (v19) uses backward-looking FX expectations: the expected future exchange rate Eᵉ is treated as given / adaptive. Under this assumption a permanent open-economy supply shock has no stationary equilibrium, so permanent m/z shocks are deliberately out of scope in v19 (the de-anchoring scenario uses a transitory pulse instead). A faithful treatment of permanent open-economy supply shocks requires forward-looking expectations (Blanchard Ch. 20), where Eᵉ is pinned by the expected future path of fundamentals. Planned as a v2 of the open-economy model.</w:t>
+        <w:t xml:space="preserve">The open-economy stage uses backward-looking FX expectations: the expected future exchange rate Eᵉ is treated as given / adaptive. Under this assumption a permanent open-economy supply shock has no stationary equilibrium, so permanent m/z shocks are deliberately out of scope in v19 (the de-anchoring scenario uses a transitory pulse instead). A faithful treatment of permanent open-economy supply shocks requires forward-looking expectations (Blanchard Ch. 20), where Eᵉ is pinned by the expected future path of fundamentals. Planned as a v2 of the open-economy model.</w:t>
       </w:r>
     </w:p>
     <w:p>
@@ -9306,7 +9341,7 @@
         <w:jc w:val="both"/>
       </w:pPr>
       <w:r>
-        <w:t xml:space="preserve">Each chart in both variants has a collapsible "Show the equations behind this chart" panel that renders the live equations line by line (consumption, investment, government, the Phillips curve, UIP, etc.), with the symbolic form, the numeric substitution, and the result. Add the Blanchard equation number to each line — just the number (e.g. "3.3", "9.1", "8.7", "19.5") — right-aligned to the edge of the dropdown box, so each line reads as: label · symbolic form · numeric substitution · result … (right-aligned) eq. number. The references are already mapped in this document and can be lifted directly: consumption → 3.3; investment → 5.1 / 9.1; the Y = C + I + G identity → 9.1; the real rate r = i − πᵉ → 6.4; money demand M/P = Y·L(i) → 5.3 (v16 only); the Taylor rule → Ch. 23; the Phillips curve π = πᵉ + α(Y−Yₙ)/Yₙ + … → 9.3 (with expectations 8.7 and the natural rate 8.4); UIP E = Eᵉ(1+i)/(1+i*) → 19.5; net exports / open IS → 19.1 / 19.2. Implementation note: add a right-aligned reference element to each .eq-line (the existing rows already use a label/symbolic/numeric/result layout, so a trailing right-aligned span fits the same flex row); a single line→eq-number map keyed by panel can drive it. Purpose: a student reading the live equations can jump straight to the matching passage in Blanchard.</w:t>
+        <w:t xml:space="preserve">Each chart has a collapsible "Show the equations behind this chart" panel that renders the live equations line by line (consumption, investment, government, the Phillips curve, UIP, etc.), with the symbolic form, the numeric substitution, and the result. Add the Blanchard equation number to each line — just the number (e.g. "3.3", "9.1", "8.7", "19.5") — right-aligned to the edge of the dropdown box, so each line reads as: label · symbolic form · numeric substitution · result … (right-aligned) eq. number. The references are already mapped in this document and can be lifted directly: consumption → 3.3; investment → 5.1 / 9.1; the Y = C + I + G identity → 9.1; the real rate r = i − πᵉ → 6.4; money demand M/P = Y·L(i) → 5.3 (v16 only); the Taylor rule → Ch. 23; the Phillips curve π = πᵉ + α(Y−Yₙ)/Yₙ + … → 9.3 (with expectations 8.7 and the natural rate 8.4); UIP E = Eᵉ(1+i)/(1+i*) → 19.5; net exports / open IS → 19.1 / 19.2. Implementation note: add a right-aligned reference element to each .eq-line (the existing rows already use a label/symbolic/numeric/result layout, so a trailing right-aligned span fits the same flex row); a single line→eq-number map keyed by panel can drive it. Purpose: a student reading the live equations can jump straight to the matching passage in Blanchard.</w:t>
       </w:r>
     </w:p>
     <w:sectPr>

</xml_diff>